<commit_message>
Phase 1: Drop draft-time-unknown fields from formal-admin
Removes questionnaire fields the user can't know at drafting time:
- P3-PETITION: signing_month/year, will_status_original/authenticated_other/
  authenticated_notarial (filing-time facts)
- P3-OATH: notary_online, signing_month/year
- P3-ORDER: bond_required (court decides bond separately)

Templates rebuilt to render blanks (____ day of ____, 20__) for signing
dates, checkbox glyphs for notary mode, and default "accompanies this
petition" / "without bond" wording. Per David's live-test feedback.

Co-Authored-By: Claude Opus 4.7 (1M context) <noreply@anthropic.com>
</commit_message>
<xml_diff>
--- a/templates/P3-PETITION.docx
+++ b/templates/P3-PETITION.docx
@@ -707,7 +707,7 @@
           <w:i w:val="0"/>
           <w:sz w:val="24"/>
         </w:rPr>
-        <w:t>{#is_testate}The decedent’s last will dated {will_date}, {will_year}{#codicil_dates}, and codicil(s) dated {codicil_dates}{/codicil_dates}, {#will_status_original}is in the possession of the court or accompanies this petition.{/will_status_original}{#will_status_authenticated_other}An authenticated copy of the will and/or codicil deposited with or probated in another jurisdiction accompanies this petition.{/will_status_authenticated_other}{#will_status_authenticated_notarial}An authenticated copy of the notarial will or codicil, the original of which is in the possession of a foreign notary, accompanies this petition.{/will_status_authenticated_notarial} Petitioner is unaware of any unrevoked will or codicil of decedent other than as set forth above.{/is_testate}{^is_testate}After the exercise of reasonable diligence, petitioner is unaware of any unrevoked wills or codicils of decedent.{/is_testate}</w:t>
+        <w:t>{#is_testate}The decedent’s last will dated {will_date}, {will_year}{#codicil_dates}, and codicil(s) dated {codicil_dates}{/codicil_dates}, accompanies this petition. Petitioner is unaware of any unrevoked will or codicil of decedent other than as set forth above.{/is_testate}{^is_testate}After the exercise of reasonable diligence, petitioner is unaware of any unrevoked wills or codicils of decedent.{/is_testate}</w:t>
       </w:r>
     </w:p>
     <w:p>
@@ -771,7 +771,7 @@
           <w:i w:val="0"/>
           <w:sz w:val="24"/>
         </w:rPr>
-        <w:t>Signed on this _____ day of {signing_month} {signing_year}.</w:t>
+        <w:t>Signed on this _____ day of ______________________, 20____.</w:t>
       </w:r>
     </w:p>
     <w:p>

</xml_diff>